<commit_message>
docs: integrate Deniz Construction product catalogue into context and master doc
- CONTEXT.md: Added third contact number (0700 640 242) and full product catalogue
  - Solid Blocks: 4×8×16, 6×8×16, 8×8×16 inches
  - Hollow Blocks: 4×8×16, 6×8×16, 8×8×16 inches
  - Pavers: 60mm and 80mm thickness (Interlocking, Rectangular, Hexagonal)
  - Kerbs: Garden and Road kerbs
- spec_master.json: Updated Products entity with Category, Dimensions, and Unit_of_Measure reflecting actual catalogue
- Master document regenerated with updated database design
</commit_message>
<xml_diff>
--- a/project_deliverables/MASTER-Requirements-Specification-Traceability-Management.docx
+++ b/project_deliverables/MASTER-Requirements-Specification-Traceability-Management.docx
@@ -3355,7 +3355,7 @@
           <w:color w:val="000000"/>
           <w:sz w:val="24"/>
         </w:rPr>
-        <w:t>The following entities form the normalized relational schema (Third Normal Form).</w:t>
+        <w:t>The following entities form the normalized relational schema (Third Normal Form). The Products entity now reflects the actual Deniz Construction Limited product catalogue.</w:t>
       </w:r>
     </w:p>
     <w:tbl>
@@ -3674,7 +3674,7 @@
                 <w:color w:val="000000"/>
                 <w:sz w:val="24"/>
               </w:rPr>
-              <w:t>Name, Unit_Price, VAT_Rate, Unit_of_Measure, Current_Stock, Reorder_Level</w:t>
+              <w:t>Name, Category (Solid Block, Hollow Block, Paver, Kerb), Dimensions, Unit_Price, VAT_Rate, Unit_of_Measure (Pieces, Square Meters, Bundles), Current_Stock, Reorder_Level</w:t>
             </w:r>
           </w:p>
         </w:tc>

</xml_diff>